<commit_message>
refactor: Simplify codeBlock border styling in build_lspotato_doc.js
</commit_message>
<xml_diff>
--- a/docs/LSPotato-Technical-Reference.docx
+++ b/docs/LSPotato-Technical-Reference.docx
@@ -2038,10 +2038,7 @@
     <w:p>
       <w:pPr>
         <w:pBdr>
-          <w:top w:val="single" w:color="DDDDDD" w:sz="4" w:space="4"/>
-          <w:bottom w:val="single" w:color="DDDDDD" w:sz="4" w:space="4"/>
-          <w:left w:val="single" w:color="B5341B" w:sz="12" w:space="6"/>
-          <w:right w:val="single" w:color="DDDDDD" w:sz="4" w:space="4"/>
+          <w:left w:val="single" w:color="B5341B" w:sz="18" w:space="8"/>
         </w:pBdr>
         <w:shd w:fill="F4F4F4" w:val="clear"/>
         <w:spacing w:after="120" w:before="60"/>

</xml_diff>